<commit_message>
1.1.5-rasm namunasi: faqat 2021–2025-yillar (G-7, 12 bank)
Co-Authored-By: Claude Opus 5.5 <noreply@anthropic.com>
Claude-Session: https://claude.ai/code/session_01PxHTC8Q7yHdrpAeUA5KUgM
</commit_message>
<xml_diff>
--- a/Namuna_1.1.5-rasm_yangi.docx
+++ b/Namuna_1.1.5-rasm_yangi.docx
@@ -27,7 +27,7 @@
           <w:i w:val="0"/>
           <w:sz w:val="28"/>
         </w:rPr>
-        <w:t>Buni rivojlangan mamlakatlar bank tizimlari tajribasi ham tasdiqlaydi: 1.1.5-rasmda AQSh va “Katta yettilik” mamlakatlarida banklar moliyaviy barqarorligi yo‘qotilishining sabablari uch davr bo‘yicha taqqoslangan – 1979–1987-yillar, 2008–2010-yillardagi global moliyaviy inqiroz davri hamda 2021–2025-yillar.</w:t>
+        <w:t>Buni rivojlangan mamlakatlar bank tizimlari tajribasi ham tasdiqlaydi. 1.1.5-rasmda “Katta yettilik” mamlakatlarida 2021–2025-yillarda faoliyati to‘xtatilgan banklar misolida moliyaviy barqarorlik yo‘qotilishining sabablari keltirilgan.</w:t>
       </w:r>
     </w:p>
     <w:p>
@@ -65,7 +65,7 @@
           <w:i w:val="0"/>
           <w:sz w:val="28"/>
         </w:rPr>
-        <w:t>1.1.5-rasm. Rivojlangan mamlakatlarda banklar moliyaviy barqarorligi yo‘qotilishining sabablari, tegishli sabab qayd etilgan banklar ulushi, %[3]</w:t>
+        <w:t>1.1.5-rasm. “Katta yettilik” mamlakatlarida 2021–2025-yillarda faoliyati to‘xtatilgan banklarda moliyaviy barqarorlik yo‘qotilishining sabablari, tegishli sabab qayd etilgan banklar ulushi, %[1]</w:t>
       </w:r>
     </w:p>
     <w:p>
@@ -79,7 +79,7 @@
           <w:i w:val="0"/>
           <w:sz w:val="28"/>
         </w:rPr>
-        <w:t>Rasm ma’lumotlari shuni ko‘rsatadiki, uchala davrda ham boshqaruv va kengash nazoratining zaifligi banklar barqarorligi yo‘qotilishining eng ko‘p qayd etiladigan sababi bo‘lib qolmoqda: 1979–1987-yillarda u muammoli banklarning 90 foizida, 2008–2010-yillarda Federal rezerv tizimi nazoratidagi faoliyati to‘xtatilgan 20 ta bankning barchasida, 2021–2025-yillarda esa “Katta yettilik” mamlakatlarida faoliyati to‘xtatilgan 12 ta bankning 58 foizida qayd etilgan (9-ilova). Aktivlar sifati va kredit konsentratsiyasining ulushi esa oldingi davrlardagi 98–100 foizdan 17 foizgacha pasaygan, chunki so‘nggi davrdagi yirik banklar muvaffaqiyatsizliklari kredit zararlari bilan emas, balki likvidlik va foiz stavkasi riski bilan bog‘liq bo‘ldi. 2023-yilda Silicon Valley Bank va First Republic Bank misolida sug‘urtalanmagan depozitlarning yuqori konsentratsiyasi va uzoq muddatli aktivlar bo‘yicha foiz stavkasi riski bir necha kun ichida likvidlik inqiroziga aylanishi mumkinligi namoyon bo‘ldi[1]: 12 ta bankning 33 foizida likvidlik va moliyalashtirish, 25 foizida esa foiz stavkasi riski asosiy sabablar qatorida bo‘lgan. Kichik banklarda esa firibgarlik (33 foiz) va ichki nazorat tizimining buzilishi (33 foiz) yetakchi sabablarga aylangan.</w:t>
+        <w:t>Rasm ma’lumotlari shuni ko‘rsatadiki, boshqaruv va kengash nazoratining zaifligi banklar barqarorligi yo‘qotilishining eng ko‘p qayd etilgan sababi bo‘lib, u 12 ta bankning 58 foizida kuzatilgan (9-ilova). Undan keyingi o‘rinlarda likvidlik va moliyalashtirish muammolari, ichki nazorat tizimining zaifligi va firibgarlik turadi (har biri 33 foiz). 2023-yilda Silicon Valley Bank va First Republic Bank misolida sug‘urtalanmagan depozitlarning yuqori konsentratsiyasi va uzoq muddatli aktivlar bo‘yicha foiz stavkasi riski bir necha kun ichida likvidlik inqiroziga aylanishi mumkinligi namoyon bo‘ldi[2], foiz stavkasi riski esa 25 foiz bankda asosiy sabablar qatorida bo‘lgan. Aktivlar sifati va kredit konsentratsiyasi faqat 17 foiz holatda asosiy sabab bo‘lgan, chunki so‘nggi yillardagi yirik banklar muvaffaqiyatsizliklari kredit zararlari bilan emas, balki likvidlik va foiz stavkasi riski bilan bog‘liq bo‘ldi. Kichik banklarda esa firibgarlik va ichki nazorat tizimining buzilishi yetakchi sabablarga aylangan.</w:t>
       </w:r>
     </w:p>
     <w:p>
@@ -93,7 +93,7 @@
           <w:i w:val="0"/>
           <w:sz w:val="28"/>
         </w:rPr>
-        <w:t>Ommaviy depozitlar oqimi bank faoliyatining to‘xtatilishiga bevosita sabab bo‘lgan hollarda ham uning ortida odatda fundamental zaifliklar turadi. S. Korreya, S. Lak va E. Verner AQSh bank tizimining 1863–2024-yillardagi ma’lumotlarini o‘rganib, AQSh Valyuta nazorati boshqarmasi 1865–1937-yillarda faoliyati to‘xtatilgan banklarning 2 foizdan kamida ommaviy mablag‘ talab qilishni asosiy sabab deb topganini, banklar inqirozlarining asosiy sababi esa deyarli har doim bank fundamental ko‘rsatkichlarining yomonlashuvi ekanini ko‘rsatgan[2]. Bundan kelib chiqadiki, moliyaviy barqarorlikni baholashda aktivlar sifati va boshqaruv sifati bilan bir qatorda likvidlik hamda bozor risklariga, O‘zbekiston sharoitida birinchi navbatda valyuta riskiga sezgirlik bloklari ham bo‘lishi lozim.</w:t>
+        <w:t>Ommaviy depozitlar oqimi bank faoliyatining to‘xtatilishiga bevosita sabab bo‘lgan hollarda ham uning ortida odatda fundamental zaifliklar turadi. S. Korreya, S. Lak va E. Verner AQSh bank tizimining 1863–2024-yillardagi ma’lumotlarini o‘rganib, AQSh Valyuta nazorati boshqarmasi 1865–1937-yillarda faoliyati to‘xtatilgan banklarning 2 foizdan kamida ommaviy mablag‘ talab qilishni asosiy sabab deb topganini, banklar inqirozlarining asosiy sababi esa deyarli har doim bank fundamental ko‘rsatkichlarining yomonlashuvi ekanini ko‘rsatgan[3]. Bundan kelib chiqadiki, moliyaviy barqarorlikni baholashda aktivlar sifati va boshqaruv sifati bilan bir qatorda likvidlik hamda bozor risklariga, O‘zbekiston sharoitida birinchi navbatda valyuta riskiga sezgirlik bloklari ham bo‘lishi lozim.</w:t>
       </w:r>
     </w:p>
     <w:p>
@@ -3030,7 +3030,7 @@
           <w:i w:val="0"/>
           <w:sz w:val="22"/>
         </w:rPr>
-        <w:t>[1] Board of Governors of the Federal Reserve System, Office of Inspector General. Material Loss Review of Silicon Valley Bank: Report 2023-SR-B-013. – Washington, DC, September 25, 2023. – Executive Summary; FDIC Office of Inspector General. Material Loss Review of First Republic Bank: Report EVAL-24-03. – Arlington, VA, November 2023. – Executive Summary.</w:t>
+        <w:t>[1] Tadqiqot natijasida muallif tomonidan 9-ilovada keltirilgan rasmiy hisobotlar asosida ishlab chiqildi (12 ta bank). Bir bankda bir nechta sabab qayd etilishi mumkin.</w:t>
       </w:r>
     </w:p>
     <w:p>
@@ -3044,7 +3044,7 @@
           <w:i w:val="0"/>
           <w:sz w:val="22"/>
         </w:rPr>
-        <w:t>[2] Correia S., Luck S., Verner E. Failing Banks // Quarterly Journal of Economics. – 2026. – Vol. 141, No. 1. – P. 147–204; ishchi varianti: arXiv:2506.06082. – 2025. – P. 1, 52.</w:t>
+        <w:t>[2] Board of Governors of the Federal Reserve System, Office of Inspector General. Material Loss Review of Silicon Valley Bank: Report 2023-SR-B-013. – Washington, DC, September 25, 2023. – Executive Summary; FDIC Office of Inspector General. Material Loss Review of First Republic Bank: Report EVAL-24-03. – Arlington, VA, November 2023. – Executive Summary.</w:t>
       </w:r>
     </w:p>
     <w:p>
@@ -3058,7 +3058,7 @@
           <w:i w:val="0"/>
           <w:sz w:val="22"/>
         </w:rPr>
-        <w:t>[3] Tadqiqot natijasida muallif tomonidan quyidagi manbalar asosida ishlab chiqildi: 1979–1987-yillar – Оценка финансовой устойчивости кредитной организации: учебник / под ред. О.И. Лаврушина, И.Д. Мамоновой. – М.: КНОРУС, 2011. – С. 44; 2008–2010-yillar – Board of Governors of the Federal Reserve System, Office of Inspector General. Summary Analysis of Failed Bank Reviews. – Washington, DC, September 2011. – P. 8–10, 47 (Federal rezerv tizimi nazoratidagi faoliyati to‘xtatilgan 20 ta bank); 2021–2025-yillar – 9-ilovada keltirilgan rasmiy hisobotlar asosida (12 ta bank). Bir bankda bir nechta sabab qayd etilishi mumkin; ustunning yo‘qligi tegishli tadqiqotda bu sabab alohida baholanmaganini bildiradi.</w:t>
+        <w:t>[3] Correia S., Luck S., Verner E. Failing Banks // Quarterly Journal of Economics. – 2026. – Vol. 141, No. 1. – P. 147–204; ishchi varianti: arXiv:2506.06082. – 2025. – P. 1, 52.</w:t>
       </w:r>
     </w:p>
     <w:sectPr>
@@ -26951,121 +26951,7 @@
               <c:strCache>
                 <c:ptCount val="1"/>
                 <c:pt idx="0">
-                  <c:v>1979–1987-yillar (AQSh)</c:v>
-                </c:pt>
-              </c:strCache>
-            </c:strRef>
-          </c:tx>
-          <c:spPr>
-            <a:solidFill>
-              <a:srgbClr val="7F7F7F"/>
-            </a:solidFill>
-            <a:ln w="6350">
-              <a:solidFill>
-                <a:srgbClr val="FFFFFF"/>
-              </a:solidFill>
-            </a:ln>
-          </c:spPr>
-          <c:invertIfNegative val="0"/>
-          <c:dLbls>
-            <c:numFmt formatCode="0" sourceLinked="0"/>
-            <c:spPr>
-              <a:noFill/>
-              <a:ln>
-                <a:noFill/>
-              </a:ln>
-            </c:spPr>
-            <c:txPr>
-              <a:bodyPr/>
-              <a:lstStyle/>
-              <a:p>
-                <a:pPr>
-                  <a:defRPr sz="1050" b="1">
-                    <a:solidFill>
-                      <a:srgbClr val="000000"/>
-                    </a:solidFill>
-                    <a:latin typeface="Times New Roman"/>
-                    <a:cs typeface="Times New Roman"/>
-                  </a:defRPr>
-                </a:pPr>
-                <a:endParaRPr lang="uz-Latn-UZ"/>
-              </a:p>
-            </c:txPr>
-            <c:dLblPos val="outEnd"/>
-            <c:showLegendKey val="0"/>
-            <c:showVal val="1"/>
-            <c:showCatName val="0"/>
-            <c:showSerName val="0"/>
-            <c:showPercent val="0"/>
-            <c:showBubbleSize val="0"/>
-          </c:dLbls>
-          <c:cat>
-            <c:strRef>
-              <c:f>Sheet1!$A$2:$A$8</c:f>
-              <c:strCache>
-                <c:ptCount val="7"/>
-                <c:pt idx="0">
-                  <c:v>Boshqaruv va kengash
-nazoratining zaifligi</c:v>
-                </c:pt>
-                <c:pt idx="1">
-                  <c:v>Aktivlar sifati va kredit
-konsentratsiyasi</c:v>
-                </c:pt>
-                <c:pt idx="2">
-                  <c:v>Ichki nazorat va
-auditning zaifligi</c:v>
-                </c:pt>
-                <c:pt idx="3">
-                  <c:v>Firibgarlik</c:v>
-                </c:pt>
-                <c:pt idx="4">
-                  <c:v>Likvidlik va
-moliyalashtirish</c:v>
-                </c:pt>
-                <c:pt idx="5">
-                  <c:v>Foiz stavkasi
-riski</c:v>
-                </c:pt>
-                <c:pt idx="6">
-                  <c:v>Daromadlilik va
-biznes modeli</c:v>
-                </c:pt>
-              </c:strCache>
-            </c:strRef>
-          </c:cat>
-          <c:val>
-            <c:numRef>
-              <c:f>Sheet1!$B$2:$B$8</c:f>
-              <c:numCache>
-                <c:formatCode>General</c:formatCode>
-                <c:ptCount val="7"/>
-                <c:pt idx="0">
-                  <c:v>90</c:v>
-                </c:pt>
-                <c:pt idx="1">
-                  <c:v>98</c:v>
-                </c:pt>
-                <c:pt idx="2">
-                  <c:v>25</c:v>
-                </c:pt>
-                <c:pt idx="3">
-                  <c:v>11</c:v>
-                </c:pt>
-              </c:numCache>
-            </c:numRef>
-          </c:val>
-        </c:ser>
-        <c:ser>
-          <c:idx val="1"/>
-          <c:order val="1"/>
-          <c:tx>
-            <c:strRef>
-              <c:f>Sheet1!$C$1</c:f>
-              <c:strCache>
-                <c:ptCount val="1"/>
-                <c:pt idx="0">
-                  <c:v>2008–2010-yillar (AQSh)</c:v>
+                  <c:v>2021–2025-yillar</c:v>
                 </c:pt>
               </c:strCache>
             </c:strRef>
@@ -27123,23 +27009,23 @@
 nazoratining zaifligi</c:v>
                 </c:pt>
                 <c:pt idx="1">
-                  <c:v>Aktivlar sifati va kredit
-konsentratsiyasi</c:v>
-                </c:pt>
-                <c:pt idx="2">
                   <c:v>Ichki nazorat va
 auditning zaifligi</c:v>
                 </c:pt>
-                <c:pt idx="3">
+                <c:pt idx="2">
                   <c:v>Firibgarlik</c:v>
                 </c:pt>
-                <c:pt idx="4">
+                <c:pt idx="3">
                   <c:v>Likvidlik va
 moliyalashtirish</c:v>
                 </c:pt>
-                <c:pt idx="5">
+                <c:pt idx="4">
                   <c:v>Foiz stavkasi
 riski</c:v>
+                </c:pt>
+                <c:pt idx="5">
+                  <c:v>Aktivlar sifati va kredit
+konsentratsiyasi</c:v>
                 </c:pt>
                 <c:pt idx="6">
                   <c:v>Daromadlilik va
@@ -27150,121 +27036,7 @@
           </c:cat>
           <c:val>
             <c:numRef>
-              <c:f>Sheet1!$C$2:$C$8</c:f>
-              <c:numCache>
-                <c:formatCode>General</c:formatCode>
-                <c:ptCount val="7"/>
-                <c:pt idx="0">
-                  <c:v>100</c:v>
-                </c:pt>
-                <c:pt idx="1">
-                  <c:v>100</c:v>
-                </c:pt>
-                <c:pt idx="2">
-                  <c:v>80</c:v>
-                </c:pt>
-                <c:pt idx="4">
-                  <c:v>50</c:v>
-                </c:pt>
-              </c:numCache>
-            </c:numRef>
-          </c:val>
-        </c:ser>
-        <c:ser>
-          <c:idx val="2"/>
-          <c:order val="2"/>
-          <c:tx>
-            <c:strRef>
-              <c:f>Sheet1!$D$1</c:f>
-              <c:strCache>
-                <c:ptCount val="1"/>
-                <c:pt idx="0">
-                  <c:v>2021–2025-yillar (“Katta yettilik”, 12 ta bank)</c:v>
-                </c:pt>
-              </c:strCache>
-            </c:strRef>
-          </c:tx>
-          <c:spPr>
-            <a:solidFill>
-              <a:srgbClr val="EB6834"/>
-            </a:solidFill>
-            <a:ln w="6350">
-              <a:solidFill>
-                <a:srgbClr val="FFFFFF"/>
-              </a:solidFill>
-            </a:ln>
-          </c:spPr>
-          <c:invertIfNegative val="0"/>
-          <c:dLbls>
-            <c:numFmt formatCode="0" sourceLinked="0"/>
-            <c:spPr>
-              <a:noFill/>
-              <a:ln>
-                <a:noFill/>
-              </a:ln>
-            </c:spPr>
-            <c:txPr>
-              <a:bodyPr/>
-              <a:lstStyle/>
-              <a:p>
-                <a:pPr>
-                  <a:defRPr sz="1050" b="1">
-                    <a:solidFill>
-                      <a:srgbClr val="000000"/>
-                    </a:solidFill>
-                    <a:latin typeface="Times New Roman"/>
-                    <a:cs typeface="Times New Roman"/>
-                  </a:defRPr>
-                </a:pPr>
-                <a:endParaRPr lang="uz-Latn-UZ"/>
-              </a:p>
-            </c:txPr>
-            <c:dLblPos val="outEnd"/>
-            <c:showLegendKey val="0"/>
-            <c:showVal val="1"/>
-            <c:showCatName val="0"/>
-            <c:showSerName val="0"/>
-            <c:showPercent val="0"/>
-            <c:showBubbleSize val="0"/>
-          </c:dLbls>
-          <c:cat>
-            <c:strRef>
-              <c:f>Sheet1!$A$2:$A$8</c:f>
-              <c:strCache>
-                <c:ptCount val="7"/>
-                <c:pt idx="0">
-                  <c:v>Boshqaruv va kengash
-nazoratining zaifligi</c:v>
-                </c:pt>
-                <c:pt idx="1">
-                  <c:v>Aktivlar sifati va kredit
-konsentratsiyasi</c:v>
-                </c:pt>
-                <c:pt idx="2">
-                  <c:v>Ichki nazorat va
-auditning zaifligi</c:v>
-                </c:pt>
-                <c:pt idx="3">
-                  <c:v>Firibgarlik</c:v>
-                </c:pt>
-                <c:pt idx="4">
-                  <c:v>Likvidlik va
-moliyalashtirish</c:v>
-                </c:pt>
-                <c:pt idx="5">
-                  <c:v>Foiz stavkasi
-riski</c:v>
-                </c:pt>
-                <c:pt idx="6">
-                  <c:v>Daromadlilik va
-biznes modeli</c:v>
-                </c:pt>
-              </c:strCache>
-            </c:strRef>
-          </c:cat>
-          <c:val>
-            <c:numRef>
-              <c:f>Sheet1!$D$2:$D$8</c:f>
+              <c:f>Sheet1!$B$2:$B$8</c:f>
               <c:numCache>
                 <c:formatCode>General</c:formatCode>
                 <c:ptCount val="7"/>
@@ -27272,7 +27044,7 @@
                   <c:v>58</c:v>
                 </c:pt>
                 <c:pt idx="1">
-                  <c:v>17</c:v>
+                  <c:v>33</c:v>
                 </c:pt>
                 <c:pt idx="2">
                   <c:v>33</c:v>
@@ -27281,10 +27053,10 @@
                   <c:v>33</c:v>
                 </c:pt>
                 <c:pt idx="4">
-                  <c:v>33</c:v>
+                  <c:v>25</c:v>
                 </c:pt>
                 <c:pt idx="5">
-                  <c:v>25</c:v>
+                  <c:v>17</c:v>
                 </c:pt>
                 <c:pt idx="6">
                   <c:v>8</c:v>
@@ -27293,7 +27065,7 @@
             </c:numRef>
           </c:val>
         </c:ser>
-        <c:gapWidth val="50"/>
+        <c:gapWidth val="60"/>
         <c:axId val="111"/>
         <c:axId val="222"/>
       </c:barChart>
@@ -27343,7 +27115,7 @@
         <c:axId val="222"/>
         <c:scaling>
           <c:orientation val="minMax"/>
-          <c:max val="100"/>
+          <c:max val="70"/>
           <c:min val="0"/>
         </c:scaling>
         <c:delete val="0"/>
@@ -27387,7 +27159,7 @@
         <c:crossAx val="111"/>
         <c:crosses val="max"/>
         <c:crossBetween val="between"/>
-        <c:majorUnit val="20"/>
+        <c:majorUnit val="10"/>
       </c:valAx>
       <c:spPr>
         <a:noFill/>
@@ -27396,26 +27168,6 @@
         </a:ln>
       </c:spPr>
     </c:plotArea>
-    <c:legend>
-      <c:legendPos val="b"/>
-      <c:overlay val="0"/>
-      <c:txPr>
-        <a:bodyPr/>
-        <a:lstStyle/>
-        <a:p>
-          <a:pPr>
-            <a:defRPr sz="1050" b="0">
-              <a:solidFill>
-                <a:srgbClr val="000000"/>
-              </a:solidFill>
-              <a:latin typeface="Times New Roman"/>
-              <a:cs typeface="Times New Roman"/>
-            </a:defRPr>
-          </a:pPr>
-          <a:endParaRPr lang="uz-Latn-UZ"/>
-        </a:p>
-      </c:txPr>
-    </c:legend>
     <c:plotVisOnly val="1"/>
     <c:dispBlanksAs val="gap"/>
   </c:chart>

</xml_diff>